<commit_message>
Use Katarinahissen viewpoint, add Stora Bageriet route and dinner-at-home option
Wednesday sunset moves from Fjällgatan to the Katarinahissen lift at
Slussen. Adds an alternative walk back from Skansen via Strandvägen
with fika at Stora Bageriet before the palace, and dinner at home as
an alternative on Thursday. Applied to both pages and the Word file.

Co-Authored-By: Claude Opus 5.5 <noreply@anthropic.com>
Claude-Session: https://claude.ai/code/session_01DxYc3Sxw5iEDtA23D2KAH7
</commit_message>
<xml_diff>
--- a/itinerary/stockholm-parents-uk.docx
+++ b/itinerary/stockholm-parents-uk.docx
@@ -1043,7 +1043,7 @@
                 <w:sz w:val="20"/>
                 <w:szCs w:val="20"/>
               </w:rPr>
-              <w:t xml:space="preserve">17:40</w:t>
+              <w:t xml:space="preserve">17:30</w:t>
             </w:r>
           </w:p>
         </w:tc>
@@ -1076,7 +1076,7 @@
                 <w:sz w:val="20"/>
                 <w:szCs w:val="20"/>
               </w:rPr>
-              <w:t xml:space="preserve">Захід сонця на Fjällgatan</w:t>
+              <w:t xml:space="preserve">Захід сонця з ліфта Katarinahissen</w:t>
             </w:r>
           </w:p>
         </w:tc>
@@ -1107,7 +1107,7 @@
                 <w:sz w:val="19"/>
                 <w:szCs w:val="19"/>
               </w:rPr>
-              <w:t xml:space="preserve">Через Slussen угору, ~15 хв. Сонце сідає ~18:05</w:t>
+              <w:t xml:space="preserve">Біля Slussen, ліфт на 38 м, 08:00–22:00. Сонце сідає ~18:05</w:t>
             </w:r>
           </w:p>
         </w:tc>
@@ -1209,7 +1209,7 @@
                 <w:sz w:val="19"/>
                 <w:szCs w:val="19"/>
               </w:rPr>
-              <w:t xml:space="preserve">Від Slussen червона лінія 3 зупинки, далі 7 хв пішки</w:t>
+              <w:t xml:space="preserve">Ліфтом униз до Slussen, червона лінія 3 зупинки, далі 7 хв пішки</w:t>
             </w:r>
           </w:p>
         </w:tc>
@@ -2774,7 +2774,7 @@
                 <w:sz w:val="20"/>
                 <w:szCs w:val="20"/>
               </w:rPr>
-              <w:t xml:space="preserve">Вечеря в Tabbouli (ліванська кухня)</w:t>
+              <w:t xml:space="preserve">Вечеря в Tabbouli (ліванська кухня) або вдома</w:t>
             </w:r>
           </w:p>
         </w:tc>
@@ -2805,7 +2805,7 @@
                 <w:sz w:val="19"/>
                 <w:szCs w:val="19"/>
               </w:rPr>
-              <w:t xml:space="preserve">Tavastgatan 22 · тел. 08-429 82 55</w:t>
+              <w:t xml:space="preserve">Tavastgatan 22 · тел. 08-429 82 55. Додому: від Zinkensdamm червона + синя лінія, ~35 хв</w:t>
             </w:r>
           </w:p>
         </w:tc>
@@ -3753,6 +3753,36 @@
           <w:szCs w:val="20"/>
         </w:rPr>
         <w:t xml:space="preserve">360 крон, для людей від 65 років дешевше. Діє в метро, трамваї, на кораблику і поїзді. Збір Арланди платиться окремо.</w:t>
+      </w:r>
+    </w:p>
+    <w:p>
+      <w:pPr>
+        <w:pStyle w:val="ListParagraph"/>
+        <w:numPr>
+          <w:ilvl w:val="0"/>
+          <w:numId w:val="2"/>
+        </w:numPr>
+        <w:spacing w:after="50" w:before="0"/>
+      </w:pPr>
+      <w:r>
+        <w:rPr>
+          <w:rFonts w:ascii="Calibri" w:cs="Calibri" w:eastAsia="Calibri" w:hAnsi="Calibri"/>
+          <w:b/>
+          <w:bCs/>
+          <w:color w:val="15202B"/>
+          <w:sz w:val="20"/>
+          <w:szCs w:val="20"/>
+        </w:rPr>
+        <w:t xml:space="preserve">Середа, інший маршрут після Скансену: </w:t>
+      </w:r>
+      <w:r>
+        <w:rPr>
+          <w:rFonts w:ascii="Calibri" w:cs="Calibri" w:eastAsia="Calibri" w:hAnsi="Calibri"/>
+          <w:color w:val="15202B"/>
+          <w:sz w:val="20"/>
+          <w:szCs w:val="20"/>
+        </w:rPr>
+        <w:t xml:space="preserve">о 13:30 пішки через Djurgårdsbron і Strandvägen до Nybroplan (~30 хв, або трамвай 7), фіка в Stora Bageriet (Sibyllegatan 2, до 18:00), далі 15 хв пішки до палацу. Кораблик назад і Skeppsbro Bageri тоді пропускаємо.</w:t>
       </w:r>
     </w:p>
     <w:p>

</xml_diff>